<commit_message>
Add Shipping and returns tracking ledger sub-tabs, quality inspection checklists, and restock integration
</commit_message>
<xml_diff>
--- a/docs/Subscription_Test_Plan.docx
+++ b/docs/Subscription_Test_Plan.docx
@@ -651,6 +651,118 @@
           </w:p>
         </w:tc>
       </w:tr>
+      <w:tr>
+        <w:tc>
+          <w:tcPr>
+            <w:tcW w:type="dxa" w:w="1872"/>
+            <w:shd w:fill="FFFFFF"/>
+            <w:tcMar>
+              <w:top w:w="100" w:type="dxa"/>
+              <w:bottom w:w="100" w:type="dxa"/>
+              <w:left w:w="150" w:type="dxa"/>
+              <w:right w:w="150" w:type="dxa"/>
+            </w:tcMar>
+          </w:tcPr>
+          <w:p>
+            <w:r>
+              <w:rPr>
+                <w:rFonts w:ascii="Segoe UI" w:hAnsi="Segoe UI"/>
+                <w:color w:val="374151"/>
+                <w:sz w:val="18"/>
+              </w:rPr>
+              <w:t>**TC-FREE-05**</w:t>
+            </w:r>
+          </w:p>
+        </w:tc>
+        <w:tc>
+          <w:tcPr>
+            <w:tcW w:type="dxa" w:w="1872"/>
+            <w:shd w:fill="FFFFFF"/>
+            <w:tcMar>
+              <w:top w:w="100" w:type="dxa"/>
+              <w:bottom w:w="100" w:type="dxa"/>
+              <w:left w:w="150" w:type="dxa"/>
+              <w:right w:w="150" w:type="dxa"/>
+            </w:tcMar>
+          </w:tcPr>
+          <w:p>
+            <w:r>
+              <w:rPr>
+                <w:rFonts w:ascii="Segoe UI" w:hAnsi="Segoe UI"/>
+                <w:color w:val="374151"/>
+                <w:sz w:val="18"/>
+              </w:rPr>
+              <w:t>Return Inspection Cap</w:t>
+            </w:r>
+          </w:p>
+        </w:tc>
+        <w:tc>
+          <w:tcPr>
+            <w:tcW w:type="dxa" w:w="1872"/>
+            <w:shd w:fill="FFFFFF"/>
+            <w:tcMar>
+              <w:top w:w="100" w:type="dxa"/>
+              <w:bottom w:w="100" w:type="dxa"/>
+              <w:left w:w="150" w:type="dxa"/>
+              <w:right w:w="150" w:type="dxa"/>
+            </w:tcMar>
+          </w:tcPr>
+          <w:p>
+            <w:r>
+              <w:rPr>
+                <w:rFonts w:ascii="Segoe UI" w:hAnsi="Segoe UI"/>
+                <w:color w:val="374151"/>
+                <w:sz w:val="18"/>
+              </w:rPr>
+              <w:t>Verify returns limit enforcement on Free accounts.</w:t>
+            </w:r>
+          </w:p>
+        </w:tc>
+        <w:tc>
+          <w:tcPr>
+            <w:tcW w:type="dxa" w:w="1872"/>
+            <w:shd w:fill="FFFFFF"/>
+            <w:tcMar>
+              <w:top w:w="100" w:type="dxa"/>
+              <w:bottom w:w="100" w:type="dxa"/>
+              <w:left w:w="150" w:type="dxa"/>
+              <w:right w:w="150" w:type="dxa"/>
+            </w:tcMar>
+          </w:tcPr>
+          <w:p>
+            <w:r>
+              <w:rPr>
+                <w:rFonts w:ascii="Segoe UI" w:hAnsi="Segoe UI"/>
+                <w:color w:val="374151"/>
+                <w:sz w:val="18"/>
+              </w:rPr>
+              <w:t>System limits quality inspection tasks to 5 items monthly, requiring manual inventory restocking.</w:t>
+            </w:r>
+          </w:p>
+        </w:tc>
+        <w:tc>
+          <w:tcPr>
+            <w:tcW w:type="dxa" w:w="1872"/>
+            <w:shd w:fill="FFFFFF"/>
+            <w:tcMar>
+              <w:top w:w="100" w:type="dxa"/>
+              <w:bottom w:w="100" w:type="dxa"/>
+              <w:left w:w="150" w:type="dxa"/>
+              <w:right w:w="150" w:type="dxa"/>
+            </w:tcMar>
+          </w:tcPr>
+          <w:p>
+            <w:r>
+              <w:rPr>
+                <w:rFonts w:ascii="Segoe UI" w:hAnsi="Segoe UI"/>
+                <w:color w:val="374151"/>
+                <w:sz w:val="18"/>
+              </w:rPr>
+              <w:t>Pending</w:t>
+            </w:r>
+          </w:p>
+        </w:tc>
+      </w:tr>
     </w:tbl>
     <w:p/>
     <w:p>
@@ -1274,6 +1386,118 @@
           </w:p>
         </w:tc>
       </w:tr>
+      <w:tr>
+        <w:tc>
+          <w:tcPr>
+            <w:tcW w:type="dxa" w:w="1872"/>
+            <w:shd w:fill="FFFFFF"/>
+            <w:tcMar>
+              <w:top w:w="100" w:type="dxa"/>
+              <w:bottom w:w="100" w:type="dxa"/>
+              <w:left w:w="150" w:type="dxa"/>
+              <w:right w:w="150" w:type="dxa"/>
+            </w:tcMar>
+          </w:tcPr>
+          <w:p>
+            <w:r>
+              <w:rPr>
+                <w:rFonts w:ascii="Segoe UI" w:hAnsi="Segoe UI"/>
+                <w:color w:val="374151"/>
+                <w:sz w:val="18"/>
+              </w:rPr>
+              <w:t>**TC-BASIC-05**</w:t>
+            </w:r>
+          </w:p>
+        </w:tc>
+        <w:tc>
+          <w:tcPr>
+            <w:tcW w:type="dxa" w:w="1872"/>
+            <w:shd w:fill="FFFFFF"/>
+            <w:tcMar>
+              <w:top w:w="100" w:type="dxa"/>
+              <w:bottom w:w="100" w:type="dxa"/>
+              <w:left w:w="150" w:type="dxa"/>
+              <w:right w:w="150" w:type="dxa"/>
+            </w:tcMar>
+          </w:tcPr>
+          <w:p>
+            <w:r>
+              <w:rPr>
+                <w:rFonts w:ascii="Segoe UI" w:hAnsi="Segoe UI"/>
+                <w:color w:val="374151"/>
+                <w:sz w:val="18"/>
+              </w:rPr>
+              <w:t>Return Inspection Cap</w:t>
+            </w:r>
+          </w:p>
+        </w:tc>
+        <w:tc>
+          <w:tcPr>
+            <w:tcW w:type="dxa" w:w="1872"/>
+            <w:shd w:fill="FFFFFF"/>
+            <w:tcMar>
+              <w:top w:w="100" w:type="dxa"/>
+              <w:bottom w:w="100" w:type="dxa"/>
+              <w:left w:w="150" w:type="dxa"/>
+              <w:right w:w="150" w:type="dxa"/>
+            </w:tcMar>
+          </w:tcPr>
+          <w:p>
+            <w:r>
+              <w:rPr>
+                <w:rFonts w:ascii="Segoe UI" w:hAnsi="Segoe UI"/>
+                <w:color w:val="374151"/>
+                <w:sz w:val="18"/>
+              </w:rPr>
+              <w:t>Verify returns limit enforcement on Basic accounts.</w:t>
+            </w:r>
+          </w:p>
+        </w:tc>
+        <w:tc>
+          <w:tcPr>
+            <w:tcW w:type="dxa" w:w="1872"/>
+            <w:shd w:fill="FFFFFF"/>
+            <w:tcMar>
+              <w:top w:w="100" w:type="dxa"/>
+              <w:bottom w:w="100" w:type="dxa"/>
+              <w:left w:w="150" w:type="dxa"/>
+              <w:right w:w="150" w:type="dxa"/>
+            </w:tcMar>
+          </w:tcPr>
+          <w:p>
+            <w:r>
+              <w:rPr>
+                <w:rFonts w:ascii="Segoe UI" w:hAnsi="Segoe UI"/>
+                <w:color w:val="374151"/>
+                <w:sz w:val="18"/>
+              </w:rPr>
+              <w:t>System allows up to 100 return verification tasks monthly, with automated catalog restock actions.</w:t>
+            </w:r>
+          </w:p>
+        </w:tc>
+        <w:tc>
+          <w:tcPr>
+            <w:tcW w:type="dxa" w:w="1872"/>
+            <w:shd w:fill="FFFFFF"/>
+            <w:tcMar>
+              <w:top w:w="100" w:type="dxa"/>
+              <w:bottom w:w="100" w:type="dxa"/>
+              <w:left w:w="150" w:type="dxa"/>
+              <w:right w:w="150" w:type="dxa"/>
+            </w:tcMar>
+          </w:tcPr>
+          <w:p>
+            <w:r>
+              <w:rPr>
+                <w:rFonts w:ascii="Segoe UI" w:hAnsi="Segoe UI"/>
+                <w:color w:val="374151"/>
+                <w:sz w:val="18"/>
+              </w:rPr>
+              <w:t>Pending</w:t>
+            </w:r>
+          </w:p>
+        </w:tc>
+      </w:tr>
     </w:tbl>
     <w:p/>
     <w:p>
@@ -1878,6 +2102,118 @@
           <w:tcPr>
             <w:tcW w:type="dxa" w:w="1872"/>
             <w:shd w:fill="F9FAFB"/>
+            <w:tcMar>
+              <w:top w:w="100" w:type="dxa"/>
+              <w:bottom w:w="100" w:type="dxa"/>
+              <w:left w:w="150" w:type="dxa"/>
+              <w:right w:w="150" w:type="dxa"/>
+            </w:tcMar>
+          </w:tcPr>
+          <w:p>
+            <w:r>
+              <w:rPr>
+                <w:rFonts w:ascii="Segoe UI" w:hAnsi="Segoe UI"/>
+                <w:color w:val="374151"/>
+                <w:sz w:val="18"/>
+              </w:rPr>
+              <w:t>Pending</w:t>
+            </w:r>
+          </w:p>
+        </w:tc>
+      </w:tr>
+      <w:tr>
+        <w:tc>
+          <w:tcPr>
+            <w:tcW w:type="dxa" w:w="1872"/>
+            <w:shd w:fill="FFFFFF"/>
+            <w:tcMar>
+              <w:top w:w="100" w:type="dxa"/>
+              <w:bottom w:w="100" w:type="dxa"/>
+              <w:left w:w="150" w:type="dxa"/>
+              <w:right w:w="150" w:type="dxa"/>
+            </w:tcMar>
+          </w:tcPr>
+          <w:p>
+            <w:r>
+              <w:rPr>
+                <w:rFonts w:ascii="Segoe UI" w:hAnsi="Segoe UI"/>
+                <w:color w:val="374151"/>
+                <w:sz w:val="18"/>
+              </w:rPr>
+              <w:t>**TC-ADV-05**</w:t>
+            </w:r>
+          </w:p>
+        </w:tc>
+        <w:tc>
+          <w:tcPr>
+            <w:tcW w:type="dxa" w:w="1872"/>
+            <w:shd w:fill="FFFFFF"/>
+            <w:tcMar>
+              <w:top w:w="100" w:type="dxa"/>
+              <w:bottom w:w="100" w:type="dxa"/>
+              <w:left w:w="150" w:type="dxa"/>
+              <w:right w:w="150" w:type="dxa"/>
+            </w:tcMar>
+          </w:tcPr>
+          <w:p>
+            <w:r>
+              <w:rPr>
+                <w:rFonts w:ascii="Segoe UI" w:hAnsi="Segoe UI"/>
+                <w:color w:val="374151"/>
+                <w:sz w:val="18"/>
+              </w:rPr>
+              <w:t>Return Inspection Cap</w:t>
+            </w:r>
+          </w:p>
+        </w:tc>
+        <w:tc>
+          <w:tcPr>
+            <w:tcW w:type="dxa" w:w="1872"/>
+            <w:shd w:fill="FFFFFF"/>
+            <w:tcMar>
+              <w:top w:w="100" w:type="dxa"/>
+              <w:bottom w:w="100" w:type="dxa"/>
+              <w:left w:w="150" w:type="dxa"/>
+              <w:right w:w="150" w:type="dxa"/>
+            </w:tcMar>
+          </w:tcPr>
+          <w:p>
+            <w:r>
+              <w:rPr>
+                <w:rFonts w:ascii="Segoe UI" w:hAnsi="Segoe UI"/>
+                <w:color w:val="374151"/>
+                <w:sz w:val="18"/>
+              </w:rPr>
+              <w:t>Verify returns limit enforcement on Advance accounts.</w:t>
+            </w:r>
+          </w:p>
+        </w:tc>
+        <w:tc>
+          <w:tcPr>
+            <w:tcW w:type="dxa" w:w="1872"/>
+            <w:shd w:fill="FFFFFF"/>
+            <w:tcMar>
+              <w:top w:w="100" w:type="dxa"/>
+              <w:bottom w:w="100" w:type="dxa"/>
+              <w:left w:w="150" w:type="dxa"/>
+              <w:right w:w="150" w:type="dxa"/>
+            </w:tcMar>
+          </w:tcPr>
+          <w:p>
+            <w:r>
+              <w:rPr>
+                <w:rFonts w:ascii="Segoe UI" w:hAnsi="Segoe UI"/>
+                <w:color w:val="374151"/>
+                <w:sz w:val="18"/>
+              </w:rPr>
+              <w:t>System supports unlimited returns, integrated automated chatbot dispute routing, and instant restock actions.</w:t>
+            </w:r>
+          </w:p>
+        </w:tc>
+        <w:tc>
+          <w:tcPr>
+            <w:tcW w:type="dxa" w:w="1872"/>
+            <w:shd w:fill="FFFFFF"/>
             <w:tcMar>
               <w:top w:w="100" w:type="dxa"/>
               <w:bottom w:w="100" w:type="dxa"/>

</xml_diff>